<commit_message>
docs(career): add trust/chairman strategy (08) and ready-to-submit chairman proposals (09)
Co-authored-by: arena-agent <297053741+arena-agent@users.noreply.github.com>
</commit_message>
<xml_diff>
--- a/career/word/00-START-HERE.docx
+++ b/career/word/00-START-HERE.docx
@@ -741,6 +741,124 @@
                 <w:b/>
                 <w:sz w:val="20"/>
               </w:rPr>
+              <w:t>08-ট্রাস্ট-ও-চেয়ারম্যান-কৌশল.md</w:t>
+            </w:r>
+          </w:p>
+        </w:tc>
+        <w:tc>
+          <w:tcPr>
+            <w:tcW w:type="dxa" w:w="3324"/>
+          </w:tcPr>
+          <w:p>
+            <w:pPr>
+              <w:spacing w:after="40"/>
+            </w:pPr>
+            <w:r/>
+            <w:r>
+              <w:rPr>
+                <w:rFonts w:ascii="Nirmala UI" w:hAnsi="Nirmala UI" w:cs="Nirmala UI" w:eastAsia="Nirmala UI"/>
+                <w:b w:val="0"/>
+                <w:sz w:val="20"/>
+              </w:rPr>
+              <w:t>ট্রাস্ট/গ্রুপ অফ ইনস্টিটিউশন + চেয়ারম্যান-নির্ভর সিদ্ধান্তের জন্য নির্দিষ্ট কৌশল</w:t>
+            </w:r>
+          </w:p>
+        </w:tc>
+        <w:tc>
+          <w:tcPr>
+            <w:tcW w:type="dxa" w:w="3324"/>
+          </w:tcPr>
+          <w:p>
+            <w:pPr>
+              <w:spacing w:after="40"/>
+            </w:pPr>
+            <w:r/>
+            <w:r>
+              <w:rPr>
+                <w:rFonts w:ascii="Nirmala UI" w:hAnsi="Nirmala UI" w:cs="Nirmala UI" w:eastAsia="Nirmala UI"/>
+                <w:b/>
+                <w:sz w:val="20"/>
+              </w:rPr>
+              <w:t>আপনার পরিস্থিতিতে — আগে পড়ুন</w:t>
+            </w:r>
+          </w:p>
+        </w:tc>
+      </w:tr>
+      <w:tr>
+        <w:tc>
+          <w:tcPr>
+            <w:tcW w:type="dxa" w:w="3324"/>
+          </w:tcPr>
+          <w:p>
+            <w:pPr>
+              <w:spacing w:after="40"/>
+            </w:pPr>
+            <w:r/>
+            <w:r>
+              <w:rPr>
+                <w:rFonts w:ascii="Nirmala UI" w:hAnsi="Nirmala UI" w:cs="Nirmala UI" w:eastAsia="Nirmala UI"/>
+                <w:b/>
+                <w:sz w:val="20"/>
+              </w:rPr>
+              <w:t>09-চেয়ারম্যান-প্রপোজাল.md</w:t>
+            </w:r>
+          </w:p>
+        </w:tc>
+        <w:tc>
+          <w:tcPr>
+            <w:tcW w:type="dxa" w:w="3324"/>
+          </w:tcPr>
+          <w:p>
+            <w:pPr>
+              <w:spacing w:after="40"/>
+            </w:pPr>
+            <w:r/>
+            <w:r>
+              <w:rPr>
+                <w:rFonts w:ascii="Nirmala UI" w:hAnsi="Nirmala UI" w:cs="Nirmala UI" w:eastAsia="Nirmala UI"/>
+                <w:b w:val="0"/>
+                <w:sz w:val="20"/>
+              </w:rPr>
+              <w:t>অধ্যক্ষের মাধ্যমে চেয়ারম্যান বরাবর ৫টি প্রস্তুত চিঠি</w:t>
+            </w:r>
+          </w:p>
+        </w:tc>
+        <w:tc>
+          <w:tcPr>
+            <w:tcW w:type="dxa" w:w="3324"/>
+          </w:tcPr>
+          <w:p>
+            <w:pPr>
+              <w:spacing w:after="40"/>
+            </w:pPr>
+            <w:r/>
+            <w:r>
+              <w:rPr>
+                <w:rFonts w:ascii="Nirmala UI" w:hAnsi="Nirmala UI" w:cs="Nirmala UI" w:eastAsia="Nirmala UI"/>
+                <w:b w:val="0"/>
+                <w:sz w:val="20"/>
+              </w:rPr>
+              <w:t>অনুমোদন নেওয়ার সময়</w:t>
+            </w:r>
+          </w:p>
+        </w:tc>
+      </w:tr>
+      <w:tr>
+        <w:tc>
+          <w:tcPr>
+            <w:tcW w:type="dxa" w:w="3324"/>
+          </w:tcPr>
+          <w:p>
+            <w:pPr>
+              <w:spacing w:after="40"/>
+            </w:pPr>
+            <w:r/>
+            <w:r>
+              <w:rPr>
+                <w:rFonts w:ascii="Nirmala UI" w:hAnsi="Nirmala UI" w:cs="Nirmala UI" w:eastAsia="Nirmala UI"/>
+                <w:b/>
+                <w:sz w:val="20"/>
+              </w:rPr>
               <w:t>career-package.zip</w:t>
             </w:r>
           </w:p>
@@ -786,6 +904,48 @@
       </w:tr>
     </w:tbl>
     <w:p/>
+    <w:p>
+      <w:pPr>
+        <w:spacing w:before="80"/>
+        <w:ind w:left="454"/>
+      </w:pPr>
+      <w:r>
+        <w:rPr>
+          <w:rFonts w:ascii="Nirmala UI" w:hAnsi="Nirmala UI" w:cs="Nirmala UI" w:eastAsia="Nirmala UI"/>
+          <w:b/>
+          <w:color w:val="444444"/>
+          <w:sz w:val="22"/>
+        </w:rPr>
+        <w:t>আপনি ট্রাস্ট/গ্রুপ অব ইনস্টিটিউশনে আছেন এবং চেয়ারম্যানই সিদ্ধান্ত নেন।</w:t>
+      </w:r>
+      <w:r>
+        <w:rPr>
+          <w:rFonts w:ascii="Nirmala UI" w:hAnsi="Nirmala UI" w:cs="Nirmala UI" w:eastAsia="Nirmala UI"/>
+          <w:b w:val="0"/>
+          <w:color w:val="444444"/>
+          <w:sz w:val="22"/>
+        </w:rPr>
+        <w:t xml:space="preserve"> তাহলে পড়ার ক্রম: </w:t>
+      </w:r>
+      <w:r>
+        <w:rPr>
+          <w:rFonts w:ascii="Nirmala UI" w:hAnsi="Nirmala UI" w:cs="Nirmala UI" w:eastAsia="Nirmala UI"/>
+          <w:b/>
+          <w:color w:val="444444"/>
+          <w:sz w:val="22"/>
+        </w:rPr>
+        <w:t>০৮ → ০৯ → ০৫ → ০৬</w:t>
+      </w:r>
+      <w:r>
+        <w:rPr>
+          <w:rFonts w:ascii="Nirmala UI" w:hAnsi="Nirmala UI" w:cs="Nirmala UI" w:eastAsia="Nirmala UI"/>
+          <w:b w:val="0"/>
+          <w:color w:val="444444"/>
+          <w:sz w:val="22"/>
+        </w:rPr>
+        <w:t>, তারপর প্রয়োজনে ০১–০৩ ও ০৭। ০৮ নম্বরে আছে আপনার সবচেয়ে বড় হাতিয়ার — মাল্টি-ইনস্টিটিউশন ("এক ছাতার নিচে") ড্যাশবোর্ড, আর সম্প্রসারণের সিঁড়িকে প্রমোশনের সিঁড়িতে রূপান্তরের উপায়।</w:t>
+      </w:r>
+    </w:p>
     <w:p>
       <w:pPr>
         <w:spacing w:after="40"/>

</xml_diff>